<commit_message>
as it stands now
</commit_message>
<xml_diff>
--- a/kyleAtsResume.docx
+++ b/kyleAtsResume.docx
@@ -31,7 +31,7 @@
         <w:pStyle w:val="Normal"/>
       </w:pPr>
       <w:r>
-        <w:t xml:space="preserve">Senior CRM and lifecycle marketing leader with proven success driving revenue through Email, SMS, Push, and In-App strategy. Grew SMS from 19% to 44% of digital sales at Hanna Andersson. Strong in segmentation, automation, loyalty programs, reporting, and cross-functional leadership (3 direct reports).</w:t>
+        <w:t xml:space="preserve">Director-level lifecycle marketing leader with expertise in developing and executing global strategies that drive customer retention, expansion, and measurable business impact through personalized engagement across Email, SMS, Push, and In-App channels. Scaled SMS demand to 26% of total CRM revenue at Hanna Andersson via innovative segmentation and automation, contributing to +8.6% full-year CRM comp. Excel in elevating customer marketing maturity by introducing data-driven frameworks and workflows for insight-driven programs, while fostering cross-functional collaboration with Marketing, Product, and Sales teams to align on growth objectives. Empower high-performing teams of 3 direct reports with a growth mindset, promoting accountability, innovation, and continuous improvement in fast-paced environments. Strong analytical acumen in translating customer data into actionable insights, optimizing for metrics like CVR (+12% Y/Y) and retention to accelerate loyalty and long-term value.</w:t>
       </w:r>
     </w:p>
     <w:p>
@@ -55,7 +55,7 @@
         <w:pStyle w:val="Normal"/>
       </w:pPr>
       <w:r>
-        <w:t xml:space="preserve">CRM Strategy • Email &amp; SMS Marketing • Segmentation • Lifecycle Journeys • Retention • ESP Management • Marketing Automation • Loyalty Programs • A/B Testing • Analytics • Salesforce • Google Analytics</w:t>
+        <w:t xml:space="preserve">Lifecycle Journeys • Retention • CRM Strategy • Marketing Automation • Personalization • Segmentation • Analytics • A/B Testing • Cross-Channel Engagement • Customer Insights • ESP Management • Loyalty Programs • Salesforce • Google Analytics</w:t>
       </w:r>
     </w:p>
     <w:p>
@@ -119,6 +119,46 @@
         <w:pStyle w:val="Normal"/>
       </w:pPr>
       <w:r>
+        <w:t xml:space="preserve">• Translated lifecycle strategy into executional excellence, delivering personalized programs that drove customer impact and business growth.</w:t>
+      </w:r>
+    </w:p>
+    <w:p>
+      <w:pPr>
+        <w:pStyle w:val="Normal"/>
+      </w:pPr>
+      <w:r>
+        <w:t xml:space="preserve">• Elevated customer marketing maturity by implementing new segmentation frameworks and testing roadmaps for scalable, insight-driven engagement.</w:t>
+      </w:r>
+    </w:p>
+    <w:p>
+      <w:pPr>
+        <w:pStyle w:val="Normal"/>
+      </w:pPr>
+      <w:r>
+        <w:t xml:space="preserve">• Drove alignment and collaboration with cross-functional partners including Creative, Site, and Loyalty to embed lifecycle thinking in go-to-market initiatives.</w:t>
+      </w:r>
+    </w:p>
+    <w:p>
+      <w:pPr>
+        <w:pStyle w:val="Normal"/>
+      </w:pPr>
+      <w:r>
+        <w:t xml:space="preserve">• Empowered team with culture of accountability and innovation, coaching on strategic operation and experimentation.</w:t>
+      </w:r>
+    </w:p>
+    <w:p>
+      <w:pPr>
+        <w:pStyle w:val="Normal"/>
+      </w:pPr>
+      <w:r>
+        <w:t xml:space="preserve">• Strengthened data-driven decision making by partnering on analytics to turn engagement data into prioritization insights.</w:t>
+      </w:r>
+    </w:p>
+    <w:p>
+      <w:pPr>
+        <w:pStyle w:val="Normal"/>
+      </w:pPr>
+      <w:r>
         <w:t xml:space="preserve"/>
       </w:r>
     </w:p>
@@ -151,6 +191,46 @@
         <w:pStyle w:val="Normal"/>
       </w:pPr>
       <w:r>
+        <w:t xml:space="preserve">• Managed day-to-day lifecycle strategy with limited direction, achieving +8.6% CRM comp through personalized engagement.</w:t>
+      </w:r>
+    </w:p>
+    <w:p>
+      <w:pPr>
+        <w:pStyle w:val="Normal"/>
+      </w:pPr>
+      <w:r>
+        <w:t xml:space="preserve">• Drove personalization exceeding 50% demand from non-batch sends and &gt;20% from triggers, enhancing retention.</w:t>
+      </w:r>
+    </w:p>
+    <w:p>
+      <w:pPr>
+        <w:pStyle w:val="Normal"/>
+      </w:pPr>
+      <w:r>
+        <w:t xml:space="preserve">• Gained analytical aptitude to conduct weekly analysis and forecasting, extracting deep insights for program optimization.</w:t>
+      </w:r>
+    </w:p>
+    <w:p>
+      <w:pPr>
+        <w:pStyle w:val="Normal"/>
+      </w:pPr>
+      <w:r>
+        <w:t xml:space="preserve">• Optimized elements for personalized experiences, resulting in +12% CVR through segmentation and content testing.</w:t>
+      </w:r>
+    </w:p>
+    <w:p>
+      <w:pPr>
+        <w:pStyle w:val="Normal"/>
+      </w:pPr>
+      <w:r>
+        <w:t xml:space="preserve">• Navigated ambiguity in tech stack to deliver measurable impact on customer loyalty and expansion.</w:t>
+      </w:r>
+    </w:p>
+    <w:p>
+      <w:pPr>
+        <w:pStyle w:val="Normal"/>
+      </w:pPr>
+      <w:r>
         <w:t xml:space="preserve"/>
       </w:r>
     </w:p>
@@ -175,6 +255,38 @@
         <w:pStyle w:val="Normal"/>
       </w:pPr>
       <w:r>
+        <w:t xml:space="preserve">• Developed lifecycle programs for personalized engagement, driving customer loyalty and growth.</w:t>
+      </w:r>
+    </w:p>
+    <w:p>
+      <w:pPr>
+        <w:pStyle w:val="Normal"/>
+      </w:pPr>
+      <w:r>
+        <w:t xml:space="preserve">• Collaborated cross-functionally to align on retention objectives and data-driven insights.</w:t>
+      </w:r>
+    </w:p>
+    <w:p>
+      <w:pPr>
+        <w:pStyle w:val="Normal"/>
+      </w:pPr>
+      <w:r>
+        <w:t xml:space="preserve">• Empowered team through coaching on experimentation and continuous improvement.</w:t>
+      </w:r>
+    </w:p>
+    <w:p>
+      <w:pPr>
+        <w:pStyle w:val="Normal"/>
+      </w:pPr>
+      <w:r>
+        <w:t xml:space="preserve">• Analyzed data to strengthen decision making, optimizing for retention metrics.</w:t>
+      </w:r>
+    </w:p>
+    <w:p>
+      <w:pPr>
+        <w:pStyle w:val="Normal"/>
+      </w:pPr>
+      <w:r>
         <w:t xml:space="preserve"/>
       </w:r>
     </w:p>
@@ -199,6 +311,38 @@
         <w:pStyle w:val="Normal"/>
       </w:pPr>
       <w:r>
+        <w:t xml:space="preserve">• Executed segmentation for personalized journeys, enhancing customer retention.</w:t>
+      </w:r>
+    </w:p>
+    <w:p>
+      <w:pPr>
+        <w:pStyle w:val="Normal"/>
+      </w:pPr>
+      <w:r>
+        <w:t xml:space="preserve">• Drove alignment with stakeholders for cohesive lifecycle strategies.</w:t>
+      </w:r>
+    </w:p>
+    <w:p>
+      <w:pPr>
+        <w:pStyle w:val="Normal"/>
+      </w:pPr>
+      <w:r>
+        <w:t xml:space="preserve">• Introduced frameworks for data-driven program improvements.</w:t>
+      </w:r>
+    </w:p>
+    <w:p>
+      <w:pPr>
+        <w:pStyle w:val="Normal"/>
+      </w:pPr>
+      <w:r>
+        <w:t xml:space="preserve">• Fostered growth mindset in testing and insights generation.</w:t>
+      </w:r>
+    </w:p>
+    <w:p>
+      <w:pPr>
+        <w:pStyle w:val="Normal"/>
+      </w:pPr>
+      <w:r>
         <w:t xml:space="preserve"/>
       </w:r>
     </w:p>
@@ -247,6 +391,46 @@
         <w:pStyle w:val="Normal"/>
       </w:pPr>
       <w:r>
+        <w:t xml:space="preserve">• Elevated maturity with tools for personalized, scalable engagement.</w:t>
+      </w:r>
+    </w:p>
+    <w:p>
+      <w:pPr>
+        <w:pStyle w:val="Normal"/>
+      </w:pPr>
+      <w:r>
+        <w:t xml:space="preserve">• Collaborated with Sales and Product for aligned growth initiatives.</w:t>
+      </w:r>
+    </w:p>
+    <w:p>
+      <w:pPr>
+        <w:pStyle w:val="Normal"/>
+      </w:pPr>
+      <w:r>
+        <w:t xml:space="preserve">• Translated data into insights for retention and expansion impact.</w:t>
+      </w:r>
+    </w:p>
+    <w:p>
+      <w:pPr>
+        <w:pStyle w:val="Normal"/>
+      </w:pPr>
+      <w:r>
+        <w:t xml:space="preserve">• Balanced strategy and execution in fast-paced environment.</w:t>
+      </w:r>
+    </w:p>
+    <w:p>
+      <w:pPr>
+        <w:pStyle w:val="Normal"/>
+      </w:pPr>
+      <w:r>
+        <w:t xml:space="preserve">• Advocated customer voice through feedback integration.</w:t>
+      </w:r>
+    </w:p>
+    <w:p>
+      <w:pPr>
+        <w:pStyle w:val="Normal"/>
+      </w:pPr>
+      <w:r>
         <w:t xml:space="preserve"/>
       </w:r>
     </w:p>
@@ -279,6 +463,30 @@
         <w:pStyle w:val="Normal"/>
       </w:pPr>
       <w:r>
+        <w:t xml:space="preserve">• Supported lifecycle automation for improved retention.</w:t>
+      </w:r>
+    </w:p>
+    <w:p>
+      <w:pPr>
+        <w:pStyle w:val="Normal"/>
+      </w:pPr>
+      <w:r>
+        <w:t xml:space="preserve">• Drove data-driven optimizations in ambiguity.</w:t>
+      </w:r>
+    </w:p>
+    <w:p>
+      <w:pPr>
+        <w:pStyle w:val="Normal"/>
+      </w:pPr>
+      <w:r>
+        <w:t xml:space="preserve">• Collaborated on team initiatives for continuous improvement.</w:t>
+      </w:r>
+    </w:p>
+    <w:p>
+      <w:pPr>
+        <w:pStyle w:val="Normal"/>
+      </w:pPr>
+      <w:r>
         <w:t xml:space="preserve"/>
       </w:r>
     </w:p>
@@ -311,6 +519,30 @@
         <w:pStyle w:val="Normal"/>
       </w:pPr>
       <w:r>
+        <w:t xml:space="preserve">• Fostered collaboration for executional excellence.</w:t>
+      </w:r>
+    </w:p>
+    <w:p>
+      <w:pPr>
+        <w:pStyle w:val="Normal"/>
+      </w:pPr>
+      <w:r>
+        <w:t xml:space="preserve">• Introduced frameworks for efficient processes.</w:t>
+      </w:r>
+    </w:p>
+    <w:p>
+      <w:pPr>
+        <w:pStyle w:val="Normal"/>
+      </w:pPr>
+      <w:r>
+        <w:t xml:space="preserve">• Analyzed performance for data-driven decisions.</w:t>
+      </w:r>
+    </w:p>
+    <w:p>
+      <w:pPr>
+        <w:pStyle w:val="Normal"/>
+      </w:pPr>
+      <w:r>
         <w:t xml:space="preserve"/>
       </w:r>
     </w:p>
@@ -351,6 +583,22 @@
         <w:pStyle w:val="Normal"/>
       </w:pPr>
       <w:r>
+        <w:t xml:space="preserve">• Ensured data accuracy for customer insights.</w:t>
+      </w:r>
+    </w:p>
+    <w:p>
+      <w:pPr>
+        <w:pStyle w:val="Normal"/>
+      </w:pPr>
+      <w:r>
+        <w:t xml:space="preserve">• Collaborated on process improvements.</w:t>
+      </w:r>
+    </w:p>
+    <w:p>
+      <w:pPr>
+        <w:pStyle w:val="Normal"/>
+      </w:pPr>
+      <w:r>
         <w:t xml:space="preserve"/>
       </w:r>
     </w:p>
@@ -391,6 +639,22 @@
         <w:pStyle w:val="Normal"/>
       </w:pPr>
       <w:r>
+        <w:t xml:space="preserve">• Developed segmentation for targeted engagement.</w:t>
+      </w:r>
+    </w:p>
+    <w:p>
+      <w:pPr>
+        <w:pStyle w:val="Normal"/>
+      </w:pPr>
+      <w:r>
+        <w:t xml:space="preserve">• Drove data-driven content optimizations.</w:t>
+      </w:r>
+    </w:p>
+    <w:p>
+      <w:pPr>
+        <w:pStyle w:val="Normal"/>
+      </w:pPr>
+      <w:r>
         <w:t xml:space="preserve"/>
       </w:r>
     </w:p>
@@ -408,6 +672,22 @@
       </w:pPr>
       <w:r>
         <w:t xml:space="preserve">• Conducted content research and optimized platform data ingestion.</w:t>
+      </w:r>
+    </w:p>
+    <w:p>
+      <w:pPr>
+        <w:pStyle w:val="Normal"/>
+      </w:pPr>
+      <w:r>
+        <w:t xml:space="preserve">• Assisted in lifecycle planning and analysis.</w:t>
+      </w:r>
+    </w:p>
+    <w:p>
+      <w:pPr>
+        <w:pStyle w:val="Normal"/>
+      </w:pPr>
+      <w:r>
+        <w:t xml:space="preserve">• Supported cross-functional collaboration.</w:t>
       </w:r>
     </w:p>
     <w:p>

</xml_diff>